<commit_message>
Update TDs doublet + dipole
</commit_message>
<xml_diff>
--- a/TD/TD antenne demi onde.docx
+++ b/TD/TD antenne demi onde.docx
@@ -1,6 +1,6 @@
 
 <file path=word/document.xml><?xml version="1.0" encoding="utf-8"?>
-<w:document xmlns:wpc="http://schemas.microsoft.com/office/word/2010/wordprocessingCanvas" xmlns:cx="http://schemas.microsoft.com/office/drawing/2014/chartex" xmlns:cx1="http://schemas.microsoft.com/office/drawing/2015/9/8/chartex" xmlns:mc="http://schemas.openxmlformats.org/markup-compatibility/2006" xmlns:o="urn:schemas-microsoft-com:office:office" xmlns:r="http://schemas.openxmlformats.org/officeDocument/2006/relationships" xmlns:m="http://schemas.openxmlformats.org/officeDocument/2006/math" xmlns:v="urn:schemas-microsoft-com:vml" xmlns:wp14="http://schemas.microsoft.com/office/word/2010/wordprocessingDrawing" xmlns:wp="http://schemas.openxmlformats.org/drawingml/2006/wordprocessingDrawing" xmlns:w10="urn:schemas-microsoft-com:office:word" xmlns:w="http://schemas.openxmlformats.org/wordprocessingml/2006/main" xmlns:w14="http://schemas.microsoft.com/office/word/2010/wordml" xmlns:w15="http://schemas.microsoft.com/office/word/2012/wordml" xmlns:w16se="http://schemas.microsoft.com/office/word/2015/wordml/symex" xmlns:wpg="http://schemas.microsoft.com/office/word/2010/wordprocessingGroup" xmlns:wpi="http://schemas.microsoft.com/office/word/2010/wordprocessingInk" xmlns:wne="http://schemas.microsoft.com/office/word/2006/wordml" xmlns:wps="http://schemas.microsoft.com/office/word/2010/wordprocessingShape" mc:Ignorable="w14 w15 w16se wp14">
+<w:document xmlns:wpc="http://schemas.microsoft.com/office/word/2010/wordprocessingCanvas" xmlns:cx="http://schemas.microsoft.com/office/drawing/2014/chartex" xmlns:cx1="http://schemas.microsoft.com/office/drawing/2015/9/8/chartex" xmlns:cx2="http://schemas.microsoft.com/office/drawing/2015/10/21/chartex" xmlns:cx3="http://schemas.microsoft.com/office/drawing/2016/5/9/chartex" xmlns:cx4="http://schemas.microsoft.com/office/drawing/2016/5/10/chartex" xmlns:cx5="http://schemas.microsoft.com/office/drawing/2016/5/11/chartex" xmlns:cx6="http://schemas.microsoft.com/office/drawing/2016/5/12/chartex" xmlns:cx7="http://schemas.microsoft.com/office/drawing/2016/5/13/chartex" xmlns:cx8="http://schemas.microsoft.com/office/drawing/2016/5/14/chartex" xmlns:mc="http://schemas.openxmlformats.org/markup-compatibility/2006" xmlns:aink="http://schemas.microsoft.com/office/drawing/2016/ink" xmlns:am3d="http://schemas.microsoft.com/office/drawing/2017/model3d" xmlns:o="urn:schemas-microsoft-com:office:office" xmlns:oel="http://schemas.microsoft.com/office/2019/extlst" xmlns:r="http://schemas.openxmlformats.org/officeDocument/2006/relationships" xmlns:m="http://schemas.openxmlformats.org/officeDocument/2006/math" xmlns:v="urn:schemas-microsoft-com:vml" xmlns:wp14="http://schemas.microsoft.com/office/word/2010/wordprocessingDrawing" xmlns:wp="http://schemas.openxmlformats.org/drawingml/2006/wordprocessingDrawing" xmlns:w10="urn:schemas-microsoft-com:office:word" xmlns:w="http://schemas.openxmlformats.org/wordprocessingml/2006/main" xmlns:w14="http://schemas.microsoft.com/office/word/2010/wordml" xmlns:w15="http://schemas.microsoft.com/office/word/2012/wordml" xmlns:w16cex="http://schemas.microsoft.com/office/word/2018/wordml/cex" xmlns:w16cid="http://schemas.microsoft.com/office/word/2016/wordml/cid" xmlns:w16="http://schemas.microsoft.com/office/word/2018/wordml" xmlns:w16du="http://schemas.microsoft.com/office/word/2023/wordml/word16du" xmlns:w16sdtdh="http://schemas.microsoft.com/office/word/2020/wordml/sdtdatahash" xmlns:w16sdtfl="http://schemas.microsoft.com/office/word/2024/wordml/sdtformatlock" xmlns:w16se="http://schemas.microsoft.com/office/word/2015/wordml/symex" xmlns:wpg="http://schemas.microsoft.com/office/word/2010/wordprocessingGroup" xmlns:wpi="http://schemas.microsoft.com/office/word/2010/wordprocessingInk" xmlns:wne="http://schemas.microsoft.com/office/word/2006/wordml" xmlns:wps="http://schemas.microsoft.com/office/word/2010/wordprocessingShape" mc:Ignorable="w14 w15 w16se w16cid w16 w16cex w16sdtdh w16sdtfl w16du wp14">
   <w:body>
     <w:p>
       <w:pPr>
@@ -287,17 +287,7 @@
           <w:sz w:val="24"/>
           <w:szCs w:val="24"/>
         </w:rPr>
-        <w:t xml:space="preserve">Rappeler l’expression de la puissance émise </w:t>
-      </w:r>
-      <w:bookmarkStart w:id="0" w:name="_GoBack"/>
-      <w:bookmarkEnd w:id="0"/>
-      <w:r>
-        <w:rPr>
-          <w:rFonts w:cstheme="minorHAnsi"/>
-          <w:sz w:val="24"/>
-          <w:szCs w:val="24"/>
-        </w:rPr>
-        <w:t xml:space="preserve">par unité d’angle solide </w:t>
+        <w:t xml:space="preserve">Rappeler l’expression de la puissance émise par unité d’angle solide </w:t>
       </w:r>
       <m:oMath>
         <m:r>
@@ -692,6 +682,7 @@
           <w:sz w:val="24"/>
           <w:szCs w:val="24"/>
         </w:rPr>
+        <w:lastRenderedPageBreak/>
         <w:t>Calculer la valeur de la directivité.</w:t>
       </w:r>
     </w:p>
@@ -731,7 +722,6 @@
           <w:sz w:val="24"/>
           <w:szCs w:val="24"/>
         </w:rPr>
-        <w:lastRenderedPageBreak/>
         <w:t xml:space="preserve">La fréquence de résonance d'une antenne épaisse (ϕ ≠ 0) est </w:t>
       </w:r>
       <w:r>
@@ -1002,15 +992,7 @@
                 <w:sz w:val="24"/>
                 <w:szCs w:val="24"/>
               </w:rPr>
-              <m:t>-l</m:t>
-            </m:r>
-            <m:r>
-              <w:rPr>
-                <w:rFonts w:ascii="Cambria Math" w:hAnsi="Cambria Math" w:cstheme="minorHAnsi"/>
-                <w:sz w:val="24"/>
-                <w:szCs w:val="24"/>
-              </w:rPr>
-              <m:t>|</m:t>
+              <m:t>-l|</m:t>
             </m:r>
           </m:num>
           <m:den>
@@ -1052,6 +1034,83 @@
     </w:p>
     <w:p>
       <w:pPr>
+        <w:pStyle w:val="Paragraphedeliste"/>
+        <w:rPr>
+          <w:rFonts w:eastAsiaTheme="minorEastAsia" w:cstheme="minorHAnsi"/>
+          <w:sz w:val="24"/>
+          <w:szCs w:val="24"/>
+        </w:rPr>
+      </w:pPr>
+    </w:p>
+    <w:p>
+      <w:pPr>
+        <w:pStyle w:val="Paragraphedeliste"/>
+        <w:autoSpaceDE w:val="0"/>
+        <w:autoSpaceDN w:val="0"/>
+        <w:adjustRightInd w:val="0"/>
+        <w:spacing w:after="0" w:line="240" w:lineRule="auto"/>
+        <w:rPr>
+          <w:rFonts w:eastAsiaTheme="minorEastAsia" w:cstheme="minorHAnsi"/>
+          <w:sz w:val="24"/>
+          <w:szCs w:val="24"/>
+        </w:rPr>
+      </w:pPr>
+      <w:r>
+        <w:rPr>
+          <w:rFonts w:eastAsiaTheme="minorEastAsia" w:cstheme="minorHAnsi"/>
+          <w:sz w:val="24"/>
+          <w:szCs w:val="24"/>
+        </w:rPr>
+        <w:t>On pourra utiliser l’impédance caractéristique d’un conducteur cylindrique</w:t>
+      </w:r>
+      <w:r>
+        <w:rPr>
+          <w:rFonts w:eastAsiaTheme="minorEastAsia" w:cstheme="minorHAnsi"/>
+          <w:sz w:val="24"/>
+          <w:szCs w:val="24"/>
+        </w:rPr>
+        <w:t xml:space="preserve"> de longueur </w:t>
+      </w:r>
+      <w:r>
+        <w:rPr>
+          <w:rFonts w:eastAsiaTheme="minorEastAsia" w:cstheme="minorHAnsi"/>
+          <w:i/>
+          <w:iCs/>
+          <w:sz w:val="24"/>
+          <w:szCs w:val="24"/>
+        </w:rPr>
+        <w:t>l</w:t>
+      </w:r>
+      <w:r>
+        <w:rPr>
+          <w:rFonts w:eastAsiaTheme="minorEastAsia" w:cstheme="minorHAnsi"/>
+          <w:sz w:val="24"/>
+          <w:szCs w:val="24"/>
+        </w:rPr>
+        <w:t xml:space="preserve"> et de rayon </w:t>
+      </w:r>
+      <w:r>
+        <w:rPr>
+          <w:rFonts w:eastAsiaTheme="minorEastAsia" w:cstheme="minorHAnsi"/>
+          <w:i/>
+          <w:iCs/>
+          <w:sz w:val="24"/>
+          <w:szCs w:val="24"/>
+        </w:rPr>
+        <w:t>a</w:t>
+      </w:r>
+      <w:r>
+        <w:rPr>
+          <w:rFonts w:eastAsiaTheme="minorEastAsia" w:cstheme="minorHAnsi"/>
+          <w:sz w:val="24"/>
+          <w:szCs w:val="24"/>
+        </w:rPr>
+        <w:t xml:space="preserve"> : </w:t>
+      </w:r>
+    </w:p>
+    <w:p>
+      <w:pPr>
+        <w:pStyle w:val="Paragraphedeliste"/>
         <w:autoSpaceDE w:val="0"/>
         <w:autoSpaceDN w:val="0"/>
         <w:adjustRightInd w:val="0"/>
@@ -1063,6 +1122,154 @@
           <w:szCs w:val="24"/>
         </w:rPr>
       </w:pPr>
+      <m:oMathPara>
+        <m:oMath>
+          <m:sSub>
+            <m:sSubPr>
+              <m:ctrlPr>
+                <w:rPr>
+                  <w:rFonts w:ascii="Cambria Math" w:eastAsiaTheme="minorEastAsia" w:hAnsi="Cambria Math" w:cstheme="minorHAnsi"/>
+                  <w:i/>
+                  <w:sz w:val="24"/>
+                  <w:szCs w:val="24"/>
+                </w:rPr>
+              </m:ctrlPr>
+            </m:sSubPr>
+            <m:e>
+              <m:r>
+                <w:rPr>
+                  <w:rFonts w:ascii="Cambria Math" w:eastAsiaTheme="minorEastAsia" w:hAnsi="Cambria Math" w:cstheme="minorHAnsi"/>
+                  <w:sz w:val="24"/>
+                  <w:szCs w:val="24"/>
+                </w:rPr>
+                <m:t>Z</m:t>
+              </m:r>
+            </m:e>
+            <m:sub>
+              <m:r>
+                <w:rPr>
+                  <w:rFonts w:ascii="Cambria Math" w:eastAsiaTheme="minorEastAsia" w:hAnsi="Cambria Math" w:cstheme="minorHAnsi"/>
+                  <w:sz w:val="24"/>
+                  <w:szCs w:val="24"/>
+                </w:rPr>
+                <m:t>c</m:t>
+              </m:r>
+            </m:sub>
+          </m:sSub>
+          <m:r>
+            <w:rPr>
+              <w:rFonts w:ascii="Cambria Math" w:eastAsiaTheme="minorEastAsia" w:hAnsi="Cambria Math" w:cstheme="minorHAnsi"/>
+              <w:sz w:val="24"/>
+              <w:szCs w:val="24"/>
+            </w:rPr>
+            <m:t>=60</m:t>
+          </m:r>
+          <m:func>
+            <m:funcPr>
+              <m:ctrlPr>
+                <w:rPr>
+                  <w:rFonts w:ascii="Cambria Math" w:eastAsiaTheme="minorEastAsia" w:hAnsi="Cambria Math" w:cstheme="minorHAnsi"/>
+                  <w:sz w:val="24"/>
+                  <w:szCs w:val="24"/>
+                </w:rPr>
+              </m:ctrlPr>
+            </m:funcPr>
+            <m:fName>
+              <m:r>
+                <m:rPr>
+                  <m:sty m:val="p"/>
+                </m:rPr>
+                <w:rPr>
+                  <w:rFonts w:ascii="Cambria Math" w:eastAsiaTheme="minorEastAsia" w:hAnsi="Cambria Math" w:cstheme="minorHAnsi"/>
+                  <w:sz w:val="24"/>
+                  <w:szCs w:val="24"/>
+                </w:rPr>
+                <m:t>ln</m:t>
+              </m:r>
+              <m:ctrlPr>
+                <w:rPr>
+                  <w:rFonts w:ascii="Cambria Math" w:eastAsiaTheme="minorEastAsia" w:hAnsi="Cambria Math" w:cstheme="minorHAnsi"/>
+                  <w:i/>
+                  <w:sz w:val="24"/>
+                  <w:szCs w:val="24"/>
+                </w:rPr>
+              </m:ctrlPr>
+            </m:fName>
+            <m:e>
+              <m:r>
+                <w:rPr>
+                  <w:rFonts w:ascii="Cambria Math" w:eastAsiaTheme="minorEastAsia" w:hAnsi="Cambria Math" w:cstheme="minorHAnsi"/>
+                  <w:sz w:val="24"/>
+                  <w:szCs w:val="24"/>
+                </w:rPr>
+                <m:t>(</m:t>
+              </m:r>
+              <m:f>
+                <m:fPr>
+                  <m:ctrlPr>
+                    <w:rPr>
+                      <w:rFonts w:ascii="Cambria Math" w:eastAsiaTheme="minorEastAsia" w:hAnsi="Cambria Math" w:cstheme="minorHAnsi"/>
+                      <w:i/>
+                      <w:sz w:val="24"/>
+                      <w:szCs w:val="24"/>
+                    </w:rPr>
+                  </m:ctrlPr>
+                </m:fPr>
+                <m:num>
+                  <m:r>
+                    <w:rPr>
+                      <w:rFonts w:ascii="Cambria Math" w:eastAsiaTheme="minorEastAsia" w:hAnsi="Cambria Math" w:cstheme="minorHAnsi"/>
+                      <w:sz w:val="24"/>
+                      <w:szCs w:val="24"/>
+                    </w:rPr>
+                    <m:t>2</m:t>
+                  </m:r>
+                  <m:r>
+                    <w:rPr>
+                      <w:rFonts w:ascii="Cambria Math" w:eastAsiaTheme="minorEastAsia" w:hAnsi="Cambria Math" w:cstheme="minorHAnsi"/>
+                      <w:sz w:val="24"/>
+                      <w:szCs w:val="24"/>
+                    </w:rPr>
+                    <m:t>l</m:t>
+                  </m:r>
+                </m:num>
+                <m:den>
+                  <m:r>
+                    <w:rPr>
+                      <w:rFonts w:ascii="Cambria Math" w:eastAsiaTheme="minorEastAsia" w:hAnsi="Cambria Math" w:cstheme="minorHAnsi"/>
+                      <w:sz w:val="24"/>
+                      <w:szCs w:val="24"/>
+                    </w:rPr>
+                    <m:t>a</m:t>
+                  </m:r>
+                </m:den>
+              </m:f>
+              <m:r>
+                <w:rPr>
+                  <w:rFonts w:ascii="Cambria Math" w:eastAsiaTheme="minorEastAsia" w:hAnsi="Cambria Math" w:cstheme="minorHAnsi"/>
+                  <w:sz w:val="24"/>
+                  <w:szCs w:val="24"/>
+                </w:rPr>
+                <m:t>)</m:t>
+              </m:r>
+            </m:e>
+          </m:func>
+        </m:oMath>
+      </m:oMathPara>
+    </w:p>
+    <w:p>
+      <w:pPr>
+        <w:autoSpaceDE w:val="0"/>
+        <w:autoSpaceDN w:val="0"/>
+        <w:adjustRightInd w:val="0"/>
+        <w:spacing w:after="0" w:line="240" w:lineRule="auto"/>
+        <w:jc w:val="center"/>
+        <w:rPr>
+          <w:rFonts w:eastAsiaTheme="minorEastAsia" w:cstheme="minorHAnsi"/>
+          <w:sz w:val="24"/>
+          <w:szCs w:val="24"/>
+        </w:rPr>
+      </w:pPr>
       <w:r>
         <w:rPr>
           <w:rFonts w:cstheme="minorHAnsi"/>
@@ -1077,9 +1284,9 @@
           <w:lang w:eastAsia="fr-FR"/>
         </w:rPr>
         <w:drawing>
-          <wp:inline distT="0" distB="0" distL="0" distR="0" wp14:anchorId="1737AAD0" wp14:editId="493DBF1D">
-            <wp:extent cx="981476" cy="5724525"/>
-            <wp:effectExtent l="0" t="0" r="9525" b="0"/>
+          <wp:inline distT="0" distB="0" distL="0" distR="0" wp14:anchorId="1737AAD0" wp14:editId="15CFCC8B">
+            <wp:extent cx="858996" cy="5010150"/>
+            <wp:effectExtent l="0" t="0" r="0" b="0"/>
             <wp:docPr id="3" name="Image 3"/>
             <wp:cNvGraphicFramePr>
               <a:graphicFrameLocks xmlns:a="http://schemas.openxmlformats.org/drawingml/2006/main" noChangeAspect="1"/>
@@ -1100,7 +1307,7 @@
                   <pic:spPr>
                     <a:xfrm>
                       <a:off x="0" y="0"/>
-                      <a:ext cx="1022639" cy="5964610"/>
+                      <a:ext cx="900972" cy="5254979"/>
                     </a:xfrm>
                     <a:prstGeom prst="rect">
                       <a:avLst/>
@@ -1184,7 +1391,7 @@
 </file>
 
 <file path=word/numbering.xml><?xml version="1.0" encoding="utf-8"?>
-<w:numbering xmlns:wpc="http://schemas.microsoft.com/office/word/2010/wordprocessingCanvas" xmlns:cx="http://schemas.microsoft.com/office/drawing/2014/chartex" xmlns:cx1="http://schemas.microsoft.com/office/drawing/2015/9/8/chartex" xmlns:mc="http://schemas.openxmlformats.org/markup-compatibility/2006" xmlns:o="urn:schemas-microsoft-com:office:office" xmlns:r="http://schemas.openxmlformats.org/officeDocument/2006/relationships" xmlns:m="http://schemas.openxmlformats.org/officeDocument/2006/math" xmlns:v="urn:schemas-microsoft-com:vml" xmlns:wp14="http://schemas.microsoft.com/office/word/2010/wordprocessingDrawing" xmlns:wp="http://schemas.openxmlformats.org/drawingml/2006/wordprocessingDrawing" xmlns:w10="urn:schemas-microsoft-com:office:word" xmlns:w="http://schemas.openxmlformats.org/wordprocessingml/2006/main" xmlns:w14="http://schemas.microsoft.com/office/word/2010/wordml" xmlns:w15="http://schemas.microsoft.com/office/word/2012/wordml" xmlns:w16se="http://schemas.microsoft.com/office/word/2015/wordml/symex" xmlns:wpg="http://schemas.microsoft.com/office/word/2010/wordprocessingGroup" xmlns:wpi="http://schemas.microsoft.com/office/word/2010/wordprocessingInk" xmlns:wne="http://schemas.microsoft.com/office/word/2006/wordml" xmlns:wps="http://schemas.microsoft.com/office/word/2010/wordprocessingShape" mc:Ignorable="w14 w15 w16se wp14">
+<w:numbering xmlns:wpc="http://schemas.microsoft.com/office/word/2010/wordprocessingCanvas" xmlns:cx="http://schemas.microsoft.com/office/drawing/2014/chartex" xmlns:cx1="http://schemas.microsoft.com/office/drawing/2015/9/8/chartex" xmlns:cx2="http://schemas.microsoft.com/office/drawing/2015/10/21/chartex" xmlns:cx3="http://schemas.microsoft.com/office/drawing/2016/5/9/chartex" xmlns:cx4="http://schemas.microsoft.com/office/drawing/2016/5/10/chartex" xmlns:cx5="http://schemas.microsoft.com/office/drawing/2016/5/11/chartex" xmlns:cx6="http://schemas.microsoft.com/office/drawing/2016/5/12/chartex" xmlns:cx7="http://schemas.microsoft.com/office/drawing/2016/5/13/chartex" xmlns:cx8="http://schemas.microsoft.com/office/drawing/2016/5/14/chartex" xmlns:mc="http://schemas.openxmlformats.org/markup-compatibility/2006" xmlns:aink="http://schemas.microsoft.com/office/drawing/2016/ink" xmlns:am3d="http://schemas.microsoft.com/office/drawing/2017/model3d" xmlns:o="urn:schemas-microsoft-com:office:office" xmlns:oel="http://schemas.microsoft.com/office/2019/extlst" xmlns:r="http://schemas.openxmlformats.org/officeDocument/2006/relationships" xmlns:m="http://schemas.openxmlformats.org/officeDocument/2006/math" xmlns:v="urn:schemas-microsoft-com:vml" xmlns:wp14="http://schemas.microsoft.com/office/word/2010/wordprocessingDrawing" xmlns:wp="http://schemas.openxmlformats.org/drawingml/2006/wordprocessingDrawing" xmlns:w10="urn:schemas-microsoft-com:office:word" xmlns:w="http://schemas.openxmlformats.org/wordprocessingml/2006/main" xmlns:w14="http://schemas.microsoft.com/office/word/2010/wordml" xmlns:w15="http://schemas.microsoft.com/office/word/2012/wordml" xmlns:w16cex="http://schemas.microsoft.com/office/word/2018/wordml/cex" xmlns:w16cid="http://schemas.microsoft.com/office/word/2016/wordml/cid" xmlns:w16="http://schemas.microsoft.com/office/word/2018/wordml" xmlns:w16du="http://schemas.microsoft.com/office/word/2023/wordml/word16du" xmlns:w16sdtdh="http://schemas.microsoft.com/office/word/2020/wordml/sdtdatahash" xmlns:w16sdtfl="http://schemas.microsoft.com/office/word/2024/wordml/sdtformatlock" xmlns:w16se="http://schemas.microsoft.com/office/word/2015/wordml/symex" xmlns:wpg="http://schemas.microsoft.com/office/word/2010/wordprocessingGroup" xmlns:wpi="http://schemas.microsoft.com/office/word/2010/wordprocessingInk" xmlns:wne="http://schemas.microsoft.com/office/word/2006/wordml" xmlns:wps="http://schemas.microsoft.com/office/word/2010/wordprocessingShape" mc:Ignorable="w14 w15 w16se w16cid w16 w16cex w16sdtdh w16sdtfl w16du wp14">
   <w:abstractNum w:abstractNumId="0" w15:restartNumberingAfterBreak="0">
     <w:nsid w:val="3EAE4A49"/>
     <w:multiLevelType w:val="hybridMultilevel"/>
@@ -1271,14 +1478,14 @@
       </w:pPr>
     </w:lvl>
   </w:abstractNum>
-  <w:num w:numId="1">
+  <w:num w:numId="1" w16cid:durableId="1736662650">
     <w:abstractNumId w:val="0"/>
   </w:num>
 </w:numbering>
 </file>
 
 <file path=word/styles.xml><?xml version="1.0" encoding="utf-8"?>
-<w:styles xmlns:mc="http://schemas.openxmlformats.org/markup-compatibility/2006" xmlns:r="http://schemas.openxmlformats.org/officeDocument/2006/relationships" xmlns:w="http://schemas.openxmlformats.org/wordprocessingml/2006/main" xmlns:w14="http://schemas.microsoft.com/office/word/2010/wordml" xmlns:w15="http://schemas.microsoft.com/office/word/2012/wordml" xmlns:w16se="http://schemas.microsoft.com/office/word/2015/wordml/symex" mc:Ignorable="w14 w15 w16se">
+<w:styles xmlns:mc="http://schemas.openxmlformats.org/markup-compatibility/2006" xmlns:r="http://schemas.openxmlformats.org/officeDocument/2006/relationships" xmlns:w="http://schemas.openxmlformats.org/wordprocessingml/2006/main" xmlns:w14="http://schemas.microsoft.com/office/word/2010/wordml" xmlns:w15="http://schemas.microsoft.com/office/word/2012/wordml" xmlns:w16cex="http://schemas.microsoft.com/office/word/2018/wordml/cex" xmlns:w16cid="http://schemas.microsoft.com/office/word/2016/wordml/cid" xmlns:w16="http://schemas.microsoft.com/office/word/2018/wordml" xmlns:w16du="http://schemas.microsoft.com/office/word/2023/wordml/word16du" xmlns:w16sdtdh="http://schemas.microsoft.com/office/word/2020/wordml/sdtdatahash" xmlns:w16sdtfl="http://schemas.microsoft.com/office/word/2024/wordml/sdtformatlock" xmlns:w16se="http://schemas.microsoft.com/office/word/2015/wordml/symex" mc:Ignorable="w14 w15 w16se w16cid w16 w16cex w16sdtdh w16sdtfl w16du">
   <w:docDefaults>
     <w:rPrDefault>
       <w:rPr>
@@ -1294,7 +1501,7 @@
       </w:pPr>
     </w:pPrDefault>
   </w:docDefaults>
-  <w:latentStyles w:defLockedState="0" w:defUIPriority="99" w:defSemiHidden="0" w:defUnhideWhenUsed="0" w:defQFormat="0" w:count="371">
+  <w:latentStyles w:defLockedState="0" w:defUIPriority="99" w:defSemiHidden="0" w:defUnhideWhenUsed="0" w:defQFormat="0" w:count="376">
     <w:lsdException w:name="Normal" w:uiPriority="0" w:qFormat="1"/>
     <w:lsdException w:name="heading 1" w:uiPriority="9" w:qFormat="1"/>
     <w:lsdException w:name="heading 2" w:semiHidden="1" w:uiPriority="9" w:unhideWhenUsed="1" w:qFormat="1"/>
@@ -1666,6 +1873,11 @@
     <w:lsdException w:name="List Table 5 Dark Accent 6" w:uiPriority="50"/>
     <w:lsdException w:name="List Table 6 Colorful Accent 6" w:uiPriority="51"/>
     <w:lsdException w:name="List Table 7 Colorful Accent 6" w:uiPriority="52"/>
+    <w:lsdException w:name="Mention" w:semiHidden="1" w:unhideWhenUsed="1"/>
+    <w:lsdException w:name="Smart Hyperlink" w:semiHidden="1" w:unhideWhenUsed="1"/>
+    <w:lsdException w:name="Hashtag" w:semiHidden="1" w:unhideWhenUsed="1"/>
+    <w:lsdException w:name="Unresolved Mention" w:semiHidden="1" w:unhideWhenUsed="1"/>
+    <w:lsdException w:name="Smart Link" w:semiHidden="1" w:unhideWhenUsed="1"/>
   </w:latentStyles>
   <w:style w:type="paragraph" w:default="1" w:styleId="Normal">
     <w:name w:val="Normal"/>
@@ -1984,6 +2196,23 @@
 </file>
 
 <file path=customXml/item1.xml><?xml version="1.0" encoding="utf-8"?>
+<p:properties xmlns:p="http://schemas.microsoft.com/office/2006/metadata/properties" xmlns:xsi="http://www.w3.org/2001/XMLSchema-instance" xmlns:pc="http://schemas.microsoft.com/office/infopath/2007/PartnerControls">
+  <documentManagement>
+    <_activity xmlns="24b93afc-5c65-45a3-8bf6-cb4c530fa63f" xsi:nil="true"/>
+  </documentManagement>
+</p:properties>
+</file>
+
+<file path=customXml/item2.xml><?xml version="1.0" encoding="utf-8"?>
+<?mso-contentType ?>
+<FormTemplates xmlns="http://schemas.microsoft.com/sharepoint/v3/contenttype/forms">
+  <Display>DocumentLibraryForm</Display>
+  <Edit>DocumentLibraryForm</Edit>
+  <New>DocumentLibraryForm</New>
+</FormTemplates>
+</file>
+
+<file path=customXml/item3.xml><?xml version="1.0" encoding="utf-8"?>
 <ct:contentTypeSchema xmlns:ct="http://schemas.microsoft.com/office/2006/metadata/contentType" xmlns:ma="http://schemas.microsoft.com/office/2006/metadata/properties/metaAttributes" ct:_="" ma:_="" ma:contentTypeName="Document" ma:contentTypeID="0x010100785FF98405D2EB4FB03838E021E8E922" ma:contentTypeVersion="17" ma:contentTypeDescription="Crée un document." ma:contentTypeScope="" ma:versionID="06956fe041c7bd772aacf0acf407fe0e">
   <xsd:schema xmlns:xsd="http://www.w3.org/2001/XMLSchema" xmlns:xs="http://www.w3.org/2001/XMLSchema" xmlns:p="http://schemas.microsoft.com/office/2006/metadata/properties" xmlns:ns3="e9c688d7-7a00-41f8-93bb-d11100185b1f" xmlns:ns4="24b93afc-5c65-45a3-8bf6-cb4c530fa63f" targetNamespace="http://schemas.microsoft.com/office/2006/metadata/properties" ma:root="true" ma:fieldsID="d25578c36a8e3077e59399043e8c088a" ns3:_="" ns4:_="">
     <xsd:import namespace="e9c688d7-7a00-41f8-93bb-d11100185b1f"/>
@@ -2230,24 +2459,25 @@
 </ct:contentTypeSchema>
 </file>
 
-<file path=customXml/item2.xml><?xml version="1.0" encoding="utf-8"?>
-<?mso-contentType ?>
-<FormTemplates xmlns="http://schemas.microsoft.com/sharepoint/v3/contenttype/forms">
-  <Display>DocumentLibraryForm</Display>
-  <Edit>DocumentLibraryForm</Edit>
-  <New>DocumentLibraryForm</New>
-</FormTemplates>
+<file path=customXml/itemProps1.xml><?xml version="1.0" encoding="utf-8"?>
+<ds:datastoreItem xmlns:ds="http://schemas.openxmlformats.org/officeDocument/2006/customXml" ds:itemID="{71A2CCBA-9D5A-46C3-A0B8-BDDA338B035A}">
+  <ds:schemaRefs>
+    <ds:schemaRef ds:uri="http://schemas.microsoft.com/office/2006/metadata/properties"/>
+    <ds:schemaRef ds:uri="http://schemas.microsoft.com/office/infopath/2007/PartnerControls"/>
+    <ds:schemaRef ds:uri="24b93afc-5c65-45a3-8bf6-cb4c530fa63f"/>
+  </ds:schemaRefs>
+</ds:datastoreItem>
 </file>
 
-<file path=customXml/item3.xml><?xml version="1.0" encoding="utf-8"?>
-<p:properties xmlns:p="http://schemas.microsoft.com/office/2006/metadata/properties" xmlns:xsi="http://www.w3.org/2001/XMLSchema-instance" xmlns:pc="http://schemas.microsoft.com/office/infopath/2007/PartnerControls">
-  <documentManagement>
-    <_activity xmlns="24b93afc-5c65-45a3-8bf6-cb4c530fa63f" xsi:nil="true"/>
-  </documentManagement>
-</p:properties>
+<file path=customXml/itemProps2.xml><?xml version="1.0" encoding="utf-8"?>
+<ds:datastoreItem xmlns:ds="http://schemas.openxmlformats.org/officeDocument/2006/customXml" ds:itemID="{09B75EE3-D1CF-412C-9007-469C07C4505A}">
+  <ds:schemaRefs>
+    <ds:schemaRef ds:uri="http://schemas.microsoft.com/sharepoint/v3/contenttype/forms"/>
+  </ds:schemaRefs>
+</ds:datastoreItem>
 </file>
 
-<file path=customXml/itemProps1.xml><?xml version="1.0" encoding="utf-8"?>
+<file path=customXml/itemProps3.xml><?xml version="1.0" encoding="utf-8"?>
 <ds:datastoreItem xmlns:ds="http://schemas.openxmlformats.org/officeDocument/2006/customXml" ds:itemID="{9EEB9B2A-598E-4A04-A41A-71BD138EA5D6}">
   <ds:schemaRefs>
     <ds:schemaRef ds:uri="http://schemas.microsoft.com/office/2006/metadata/contentType"/>
@@ -2264,29 +2494,4 @@
     <ds:schemaRef ds:uri="http://schemas.microsoft.com/internal/obd"/>
   </ds:schemaRefs>
 </ds:datastoreItem>
-</file>
-
-<file path=customXml/itemProps2.xml><?xml version="1.0" encoding="utf-8"?>
-<ds:datastoreItem xmlns:ds="http://schemas.openxmlformats.org/officeDocument/2006/customXml" ds:itemID="{09B75EE3-D1CF-412C-9007-469C07C4505A}">
-  <ds:schemaRefs>
-    <ds:schemaRef ds:uri="http://schemas.microsoft.com/sharepoint/v3/contenttype/forms"/>
-  </ds:schemaRefs>
-</ds:datastoreItem>
-</file>
-
-<file path=customXml/itemProps3.xml><?xml version="1.0" encoding="utf-8"?>
-<ds:datastoreItem xmlns:ds="http://schemas.openxmlformats.org/officeDocument/2006/customXml" ds:itemID="{71A2CCBA-9D5A-46C3-A0B8-BDDA338B035A}">
-  <ds:schemaRefs>
-    <ds:schemaRef ds:uri="http://schemas.microsoft.com/office/infopath/2007/PartnerControls"/>
-    <ds:schemaRef ds:uri="http://www.w3.org/XML/1998/namespace"/>
-    <ds:schemaRef ds:uri="http://purl.org/dc/dcmitype/"/>
-    <ds:schemaRef ds:uri="http://schemas.microsoft.com/office/2006/documentManagement/types"/>
-    <ds:schemaRef ds:uri="24b93afc-5c65-45a3-8bf6-cb4c530fa63f"/>
-    <ds:schemaRef ds:uri="http://schemas.microsoft.com/office/2006/metadata/properties"/>
-    <ds:schemaRef ds:uri="http://schemas.openxmlformats.org/package/2006/metadata/core-properties"/>
-    <ds:schemaRef ds:uri="e9c688d7-7a00-41f8-93bb-d11100185b1f"/>
-    <ds:schemaRef ds:uri="http://purl.org/dc/terms/"/>
-    <ds:schemaRef ds:uri="http://purl.org/dc/elements/1.1/"/>
-  </ds:schemaRefs>
-</ds:datastoreItem>
 </file>
</xml_diff>